<commit_message>
Add GitHub repo link to section 5.2 of final document
</commit_message>
<xml_diff>
--- a/docs/Final Document.docx
+++ b/docs/Final Document.docx
@@ -2019,6 +2019,31 @@
           <w:lang w:val="en-US"/>
         </w:rPr>
       </w:pPr>
+    </w:p>
+    <w:p>
+      <w:pPr/>
+      <w:r>
+        <w:rPr>
+          <w:rFonts w:ascii="Times New Roman" w:hAnsi="Times New Roman"/>
+          <w:sz w:val="24"/>
+        </w:rPr>
+        <w:t xml:space="preserve">The complete source code for this implementation is publicly available at: </w:t>
+      </w:r>
+      <w:r>
+        <w:rPr>
+          <w:rFonts w:ascii="Times New Roman" w:hAnsi="Times New Roman"/>
+          <w:color w:val="0056CC"/>
+          <w:sz w:val="24"/>
+        </w:rPr>
+        <w:t>https://github.com/Nicolasm257/SVD-HumanFaces</w:t>
+      </w:r>
+      <w:r>
+        <w:rPr>
+          <w:rFonts w:ascii="Times New Roman" w:hAnsi="Times New Roman"/>
+          <w:sz w:val="24"/>
+        </w:rPr>
+        <w:t>.</w:t>
+      </w:r>
     </w:p>
     <w:p>
       <w:pPr>

</xml_diff>

<commit_message>
Fix repo link as proper hyperlink in section 5.2
</commit_message>
<xml_diff>
--- a/docs/Final Document.docx
+++ b/docs/Final Document.docx
@@ -2021,28 +2021,33 @@
       </w:pPr>
     </w:p>
     <w:p>
-      <w:pPr/>
-      <w:r>
-        <w:rPr>
-          <w:rFonts w:ascii="Times New Roman" w:hAnsi="Times New Roman"/>
-          <w:sz w:val="24"/>
+      <w:r>
+        <w:rPr>
+          <w:rFonts w:ascii="Times New Roman" w:hAnsi="Times New Roman"/>
+          <w:sz w:val="24"/>
+          <w:szCs w:val="24"/>
         </w:rPr>
         <w:t xml:space="preserve">The complete source code for this implementation is publicly available at: </w:t>
       </w:r>
-      <w:r>
-        <w:rPr>
-          <w:rFonts w:ascii="Times New Roman" w:hAnsi="Times New Roman"/>
-          <w:color w:val="0056CC"/>
-          <w:sz w:val="24"/>
-        </w:rPr>
-        <w:t>https://github.com/Nicolasm257/SVD-HumanFaces</w:t>
-      </w:r>
-      <w:r>
-        <w:rPr>
-          <w:rFonts w:ascii="Times New Roman" w:hAnsi="Times New Roman"/>
-          <w:sz w:val="24"/>
-        </w:rPr>
-        <w:t>.</w:t>
+      <w:hyperlink r:id="rId10" w:history="1">
+        <w:r>
+          <w:rPr>
+            <w:rFonts w:ascii="Times New Roman" w:hAnsi="Times New Roman"/>
+            <w:sz w:val="24"/>
+            <w:szCs w:val="24"/>
+            <w:u w:val="single"/>
+            <w:color w:val="0056CC"/>
+          </w:rPr>
+          <w:t xml:space="preserve">https://github.com/Nicolasm257/SVD-HumanFaces</w:t>
+        </w:r>
+      </w:hyperlink>
+      <w:r>
+        <w:rPr>
+          <w:rFonts w:ascii="Times New Roman" w:hAnsi="Times New Roman"/>
+          <w:sz w:val="24"/>
+          <w:szCs w:val="24"/>
+        </w:rPr>
+        <w:t xml:space="preserve">.</w:t>
       </w:r>
     </w:p>
     <w:p>

</xml_diff>